<commit_message>
Put the Peres logo on all four deliverables
The department template ships the logo of a different institution, the
Academic Center for Law and Business in Ramat Gan, on every slide. It is
replaced with the Peres Academic Center mark, and the picture box is
changed from the template's landscape rectangle to a square so the mark
keeps its aspect ratio.

The two Word documents gain the logo on their cover pages, which the
course handbook lists among the required cover elements and which they
were missing.

Also corrects the methodological note in the interview appendix, which
still gave interview length as one to one and a half hours after the
interviews themselves were brought into the required thirty to forty
five minute window.

Co-Authored-By: Claude Fable 5 <noreply@anthropic.com>
Claude-Session: https://claude.ai/code/session_01Aebwgiv2BDsZYZ7oiMCAJ9
</commit_message>
<xml_diff>
--- a/seminar-interviews/פרויקט-גמר-ממוגרפיה.docx
+++ b/seminar-interviews/פרויקט-גמר-ממוגרפיה.docx
@@ -4,23 +4,49 @@
   <w:body>
     <w:p>
       <w:pPr>
-        <w:keepNext w:val="false"/>
-        <w:bidi/>
-        <w:spacing w:after="0" w:before="0" w:line="240" w:lineRule="auto"/>
-        <w:jc w:val="both"/>
-      </w:pPr>
-      <w:r>
-        <w:rPr>
-          <w:rFonts w:ascii="David" w:cs="David" w:eastAsia="David" w:hAnsi="David"/>
-          <w:b w:val="false"/>
-          <w:bCs w:val="false"/>
-          <w:i w:val="false"/>
-          <w:iCs w:val="false"/>
-          <w:sz w:val="24"/>
-          <w:szCs w:val="24"/>
-          <w:rtl/>
-        </w:rPr>
-        <w:t xml:space="preserve"/>
+        <w:bidi/>
+        <w:spacing w:after="200" w:before="240" w:line="240" w:lineRule="auto"/>
+        <w:jc w:val="center"/>
+      </w:pPr>
+      <w:r>
+        <w:drawing>
+          <wp:inline distT="0" distB="0" distL="0" distR="0">
+            <wp:extent cx="904875" cy="904875"/>
+            <wp:effectExtent t="0" r="0" b="0" l="0"/>
+            <wp:docPr id="1" name="" descr="" title=""/>
+            <wp:cNvGraphicFramePr>
+              <a:graphicFrameLocks xmlns:a="http://schemas.openxmlformats.org/drawingml/2006/main" noChangeAspect="1"/>
+            </wp:cNvGraphicFramePr>
+            <a:graphic xmlns:a="http://schemas.openxmlformats.org/drawingml/2006/main">
+              <a:graphicData uri="http://schemas.openxmlformats.org/drawingml/2006/picture">
+                <pic:pic xmlns:pic="http://schemas.openxmlformats.org/drawingml/2006/picture">
+                  <pic:nvPicPr>
+                    <pic:cNvPr id="0" name="" descr=""/>
+                    <pic:cNvPicPr>
+                      <a:picLocks noChangeAspect="1" noChangeArrowheads="1"/>
+                    </pic:cNvPicPr>
+                  </pic:nvPicPr>
+                  <pic:blipFill>
+                    <a:blip r:embed="rId8" cstate="none"/>
+                    <a:srcRect/>
+                    <a:stretch>
+                      <a:fillRect/>
+                    </a:stretch>
+                  </pic:blipFill>
+                  <pic:spPr bwMode="auto">
+                    <a:xfrm>
+                      <a:off x="0" y="0"/>
+                      <a:ext cx="904875" cy="904875"/>
+                    </a:xfrm>
+                    <a:prstGeom prst="rect">
+                      <a:avLst/>
+                    </a:prstGeom>
+                  </pic:spPr>
+                </pic:pic>
+              </a:graphicData>
+            </a:graphic>
+          </wp:inline>
+        </w:drawing>
       </w:r>
     </w:p>
     <w:p>
@@ -5718,7 +5744,7 @@
                     </pic:cNvPicPr>
                   </pic:nvPicPr>
                   <pic:blipFill>
-                    <a:blip r:embed="rId8" cstate="none"/>
+                    <a:blip r:embed="rId9" cstate="none"/>
                     <a:srcRect/>
                     <a:stretch>
                       <a:fillRect/>

</xml_diff>

<commit_message>
Set the recommendations out as a numbered list
The six recommendations were a single dense paragraph on the slide and a
bullet run in the chapter, which made them hard to hold onto and hard to
refer back to in a discussion. They are now numbered one to six under
two headings, the clinic level and the health fund and ministry level,
with the recommendation itself in bold and the detail following it.

The chapter keeps the fuller wording with the measurable target on the
first item; the slide carries the short form. Two items whose detail
read as a fragment after the bold lead-in were rewritten as full
sentences.

The conclusions chapter stays at about 1.2 pages and the body at about
23.8, both inside the handbook's limits. Layout and schema checks pass.

Co-Authored-By: Claude Fable 5 <noreply@anthropic.com>
Claude-Session: https://claude.ai/code/session_01Aebwgiv2BDsZYZ7oiMCAJ9
</commit_message>
<xml_diff>
--- a/seminar-interviews/פרויקט-גמר-ממוגרפיה.docx
+++ b/seminar-interviews/פרויקט-גמר-ממוגרפיה.docx
@@ -6468,139 +6468,253 @@
           <w:szCs w:val="24"/>
           <w:rtl/>
         </w:rPr>
-        <w:t xml:space="preserve">על בסיס מסקנות אלו מוצעות ההמלצות היישומיות הבאות.</w:t>
-      </w:r>
-    </w:p>
-    <w:p>
-      <w:pPr>
-        <w:keepNext w:val="false"/>
-        <w:bidi/>
-        <w:spacing w:after="80" w:before="0" w:line="480" w:lineRule="auto"/>
-        <w:ind w:right="400" w:hanging="260"/>
-        <w:jc w:val="both"/>
-      </w:pPr>
-      <w:r>
-        <w:rPr>
-          <w:rFonts w:ascii="David" w:cs="David" w:eastAsia="David" w:hAnsi="David"/>
-          <w:b w:val="false"/>
-          <w:bCs w:val="false"/>
-          <w:i w:val="false"/>
-          <w:iCs w:val="false"/>
-          <w:sz w:val="24"/>
-          <w:szCs w:val="24"/>
-          <w:rtl/>
-        </w:rPr>
-        <w:t xml:space="preserve">•  לקבוע במרפאות ביישובים ערביים ובשכונות ערביות בערים מעורבות תפקיד של רכזת זימונים דוברת ערבית, שתפקידה אינו לשלוח מכתבים אלא לטלפן. יעד מדיד: שיחה יזומה אחת לפחות לכל אישה בגילאי 50 עד 74 שלא ביצעה בדיקה בשנתיים האחרונות, ומעקב אחר שיעור ההמרה משיחה לתור בפועל.</w:t>
-      </w:r>
-    </w:p>
-    <w:p>
-      <w:pPr>
-        <w:keepNext w:val="false"/>
-        <w:bidi/>
-        <w:spacing w:after="80" w:before="0" w:line="480" w:lineRule="auto"/>
-        <w:ind w:right="400" w:hanging="260"/>
-        <w:jc w:val="both"/>
-      </w:pPr>
-      <w:r>
-        <w:rPr>
-          <w:rFonts w:ascii="David" w:cs="David" w:eastAsia="David" w:hAnsi="David"/>
-          <w:b w:val="false"/>
-          <w:bCs w:val="false"/>
-          <w:i w:val="false"/>
-          <w:iCs w:val="false"/>
-          <w:sz w:val="24"/>
-          <w:szCs w:val="24"/>
-          <w:rtl/>
-        </w:rPr>
-        <w:t xml:space="preserve">•  להוסיף למערכת הזימון הממוחשבת התראה לרופא המשפחה בפתיחת כל ביקור של אישה בגיל הזכאות שאיחרה בבדיקה, כך שההמלצה תינתן במפגש הקליני ולא תישאר תלויה ביוזמת האישה. זהו יישום ישיר של הממצא שהמלצת המטפל היא המנבא החזק ביותר להיענות.</w:t>
-      </w:r>
-    </w:p>
-    <w:p>
-      <w:pPr>
-        <w:keepNext w:val="false"/>
-        <w:bidi/>
-        <w:spacing w:after="80" w:before="0" w:line="480" w:lineRule="auto"/>
-        <w:ind w:right="400" w:hanging="260"/>
-        <w:jc w:val="both"/>
-      </w:pPr>
-      <w:r>
-        <w:rPr>
-          <w:rFonts w:ascii="David" w:cs="David" w:eastAsia="David" w:hAnsi="David"/>
-          <w:b w:val="false"/>
-          <w:bCs w:val="false"/>
-          <w:i w:val="false"/>
-          <w:iCs w:val="false"/>
-          <w:sz w:val="24"/>
-          <w:szCs w:val="24"/>
-          <w:rtl/>
-        </w:rPr>
-        <w:t xml:space="preserve">•  לפרוס תורים לממוגרפיה בשעות אחר הצהריים ובימי שישי, ולאפשר לאישה שהגיעה לבדיקה לקבל אישור היעדרות מעבודה. שינוי זה מכוון ישירות אל החסם המעשי שעלה בראיונות ואינו דורש שינוי תרבותי כלשהו.</w:t>
-      </w:r>
-    </w:p>
-    <w:p>
-      <w:pPr>
-        <w:keepNext w:val="false"/>
-        <w:bidi/>
-        <w:spacing w:after="80" w:before="0" w:line="480" w:lineRule="auto"/>
-        <w:ind w:right="400" w:hanging="260"/>
-        <w:jc w:val="both"/>
-      </w:pPr>
-      <w:r>
-        <w:rPr>
-          <w:rFonts w:ascii="David" w:cs="David" w:eastAsia="David" w:hAnsi="David"/>
-          <w:b w:val="false"/>
-          <w:bCs w:val="false"/>
-          <w:i w:val="false"/>
-          <w:iCs w:val="false"/>
-          <w:sz w:val="24"/>
-          <w:szCs w:val="24"/>
-          <w:rtl/>
-        </w:rPr>
-        <w:t xml:space="preserve">•  להפעיל את ניידת הממוגרפיה לפי לוח שנתי קבוע וידוע מראש ולא כאירוע חד-פעמי, ולמקם אותה במקום ניטרלי ולא בחזית המרפאה, כדי לתת מענה לחשש מן החשיפה החברתית שעלה כחזק מן החשיפה הגופנית.</w:t>
-      </w:r>
-    </w:p>
-    <w:p>
-      <w:pPr>
-        <w:keepNext w:val="false"/>
-        <w:bidi/>
-        <w:spacing w:after="80" w:before="0" w:line="480" w:lineRule="auto"/>
-        <w:ind w:right="400" w:hanging="260"/>
-        <w:jc w:val="both"/>
-      </w:pPr>
-      <w:r>
-        <w:rPr>
-          <w:rFonts w:ascii="David" w:cs="David" w:eastAsia="David" w:hAnsi="David"/>
-          <w:b w:val="false"/>
-          <w:bCs w:val="false"/>
-          <w:i w:val="false"/>
-          <w:iCs w:val="false"/>
-          <w:sz w:val="24"/>
-          <w:szCs w:val="24"/>
-          <w:rtl/>
-        </w:rPr>
-        <w:t xml:space="preserve">•  להכשיר קבוצה של נשים מקומיות שכבר נבדקו, ובהן נשים שהחלימו, להנחיית מפגשים ביתיים קטנים במקום הרצאות פומביות, בליווי מקצועי ובתיאום עם המרפאה. הראיונות מלמדים כי המסגרת הקטנה היא שעושה את ההבדל, ולא תוכן המסר.</w:t>
-      </w:r>
-    </w:p>
-    <w:p>
-      <w:pPr>
-        <w:keepNext w:val="false"/>
-        <w:bidi/>
-        <w:spacing w:after="80" w:before="0" w:line="480" w:lineRule="auto"/>
-        <w:ind w:right="400" w:hanging="260"/>
-        <w:jc w:val="both"/>
-      </w:pPr>
-      <w:r>
-        <w:rPr>
-          <w:rFonts w:ascii="David" w:cs="David" w:eastAsia="David" w:hAnsi="David"/>
-          <w:b w:val="false"/>
-          <w:bCs w:val="false"/>
-          <w:i w:val="false"/>
-          <w:iCs w:val="false"/>
-          <w:sz w:val="24"/>
-          <w:szCs w:val="24"/>
-          <w:rtl/>
-        </w:rPr>
-        <w:t xml:space="preserve">•  לבחון מול משרד הבריאות הרחבה של הזימון היזום לנשים בנות 45 עד 49 בקהילות שבהן חציון גיל האבחון צעיר משמעותית, ובראשן הקהילה הבדואית בנגב, שבה חלק ניכר מן התחלואה מתרחש מתחת לגיל הסף הנוכחי.</w:t>
+        <w:t xml:space="preserve">ההמלצות מוצגות להלן לפי רמת היישום הנדרשת. שלוש הראשונות ניתנות ליישום ברמת המרפאה ובעלות נמוכה יחסית, ושלוש האחרונות מחייבות החלטה ברמת הקופה או משרד הבריאות.</w:t>
+      </w:r>
+    </w:p>
+    <w:p>
+      <w:pPr>
+        <w:keepNext/>
+        <w:bidi/>
+        <w:spacing w:after="80" w:before="160" w:line="360" w:lineRule="auto"/>
+        <w:jc w:val="right"/>
+      </w:pPr>
+      <w:r>
+        <w:rPr>
+          <w:rFonts w:ascii="David" w:cs="David" w:eastAsia="David" w:hAnsi="David"/>
+          <w:b/>
+          <w:bCs/>
+          <w:i w:val="false"/>
+          <w:iCs w:val="false"/>
+          <w:sz w:val="24"/>
+          <w:szCs w:val="24"/>
+          <w:rtl/>
+        </w:rPr>
+        <w:t xml:space="preserve">ברמת המרפאה</w:t>
+      </w:r>
+    </w:p>
+    <w:p>
+      <w:pPr>
+        <w:bidi/>
+        <w:spacing w:after="100" w:line="480" w:lineRule="auto"/>
+        <w:ind w:right="560" w:hanging="560"/>
+        <w:jc w:val="both"/>
+      </w:pPr>
+      <w:r>
+        <w:rPr>
+          <w:rFonts w:ascii="David" w:cs="David" w:eastAsia="David" w:hAnsi="David"/>
+          <w:b/>
+          <w:bCs/>
+          <w:i w:val="false"/>
+          <w:iCs w:val="false"/>
+          <w:sz w:val="24"/>
+          <w:szCs w:val="24"/>
+          <w:rtl/>
+        </w:rPr>
+        <w:t xml:space="preserve">1-  רכזת זימונים דוברת ערבית שמטלפנת ואינה שולחת מכתבים.</w:t>
+      </w:r>
+      <w:r>
+        <w:rPr>
+          <w:rFonts w:ascii="David" w:cs="David" w:eastAsia="David" w:hAnsi="David"/>
+          <w:b w:val="false"/>
+          <w:bCs w:val="false"/>
+          <w:i w:val="false"/>
+          <w:iCs w:val="false"/>
+          <w:sz w:val="24"/>
+          <w:szCs w:val="24"/>
+          <w:rtl/>
+        </w:rPr>
+        <w:t xml:space="preserve"> יעד מדיד: שיחה יזומה אחת לפחות לכל אישה בגילאי 50 עד 74 שלא ביצעה בדיקה בשנתיים האחרונות, ומעקב אחר שיעור ההמרה משיחה לתור שנקבע בפועל.</w:t>
+      </w:r>
+    </w:p>
+    <w:p>
+      <w:pPr>
+        <w:bidi/>
+        <w:spacing w:after="100" w:line="480" w:lineRule="auto"/>
+        <w:ind w:right="560" w:hanging="560"/>
+        <w:jc w:val="both"/>
+      </w:pPr>
+      <w:r>
+        <w:rPr>
+          <w:rFonts w:ascii="David" w:cs="David" w:eastAsia="David" w:hAnsi="David"/>
+          <w:b/>
+          <w:bCs/>
+          <w:i w:val="false"/>
+          <w:iCs w:val="false"/>
+          <w:sz w:val="24"/>
+          <w:szCs w:val="24"/>
+          <w:rtl/>
+        </w:rPr>
+        <w:t xml:space="preserve">2-  התראה לרופא המשפחה במפגש הקליני.</w:t>
+      </w:r>
+      <w:r>
+        <w:rPr>
+          <w:rFonts w:ascii="David" w:cs="David" w:eastAsia="David" w:hAnsi="David"/>
+          <w:b w:val="false"/>
+          <w:bCs w:val="false"/>
+          <w:i w:val="false"/>
+          <w:iCs w:val="false"/>
+          <w:sz w:val="24"/>
+          <w:szCs w:val="24"/>
+          <w:rtl/>
+        </w:rPr>
+        <w:t xml:space="preserve"> התראה אוטומטית בפתיחת כל ביקור של אישה בגיל הזכאות שאיחרה בבדיקה, כך שההמלצה תינתן ביוזמת המטפל ולא תישאר תלויה ביוזמת האישה.</w:t>
+      </w:r>
+    </w:p>
+    <w:p>
+      <w:pPr>
+        <w:bidi/>
+        <w:spacing w:after="100" w:line="480" w:lineRule="auto"/>
+        <w:ind w:right="560" w:hanging="560"/>
+        <w:jc w:val="both"/>
+      </w:pPr>
+      <w:r>
+        <w:rPr>
+          <w:rFonts w:ascii="David" w:cs="David" w:eastAsia="David" w:hAnsi="David"/>
+          <w:b/>
+          <w:bCs/>
+          <w:i w:val="false"/>
+          <w:iCs w:val="false"/>
+          <w:sz w:val="24"/>
+          <w:szCs w:val="24"/>
+          <w:rtl/>
+        </w:rPr>
+        <w:t xml:space="preserve">3-  פריסת תורים בשעות שאפשר להגיע אליהן.</w:t>
+      </w:r>
+      <w:r>
+        <w:rPr>
+          <w:rFonts w:ascii="David" w:cs="David" w:eastAsia="David" w:hAnsi="David"/>
+          <w:b w:val="false"/>
+          <w:bCs w:val="false"/>
+          <w:i w:val="false"/>
+          <w:iCs w:val="false"/>
+          <w:sz w:val="24"/>
+          <w:szCs w:val="24"/>
+          <w:rtl/>
+        </w:rPr>
+        <w:t xml:space="preserve"> אחר הצהריים וימי שישי, לצד אישור היעדרות מעבודה לאישה שהגיעה לבדיקה. המלצה זו מכוונת ישירות אל החסם המעשי שעלה בראיונות ואינה דורשת שינוי תרבותי כלשהו.</w:t>
+      </w:r>
+    </w:p>
+    <w:p>
+      <w:pPr>
+        <w:keepNext/>
+        <w:bidi/>
+        <w:spacing w:after="80" w:before="160" w:line="360" w:lineRule="auto"/>
+        <w:jc w:val="right"/>
+      </w:pPr>
+      <w:r>
+        <w:rPr>
+          <w:rFonts w:ascii="David" w:cs="David" w:eastAsia="David" w:hAnsi="David"/>
+          <w:b/>
+          <w:bCs/>
+          <w:i w:val="false"/>
+          <w:iCs w:val="false"/>
+          <w:sz w:val="24"/>
+          <w:szCs w:val="24"/>
+          <w:rtl/>
+        </w:rPr>
+        <w:t xml:space="preserve">ברמת הקופה ומשרד הבריאות</w:t>
+      </w:r>
+    </w:p>
+    <w:p>
+      <w:pPr>
+        <w:bidi/>
+        <w:spacing w:after="100" w:line="480" w:lineRule="auto"/>
+        <w:ind w:right="560" w:hanging="560"/>
+        <w:jc w:val="both"/>
+      </w:pPr>
+      <w:r>
+        <w:rPr>
+          <w:rFonts w:ascii="David" w:cs="David" w:eastAsia="David" w:hAnsi="David"/>
+          <w:b/>
+          <w:bCs/>
+          <w:i w:val="false"/>
+          <w:iCs w:val="false"/>
+          <w:sz w:val="24"/>
+          <w:szCs w:val="24"/>
+          <w:rtl/>
+        </w:rPr>
+        <w:t xml:space="preserve">4-  ניידת ממוגרפיה בלוח שנתי קבוע ובמיקום דיסקרטי.</w:t>
+      </w:r>
+      <w:r>
+        <w:rPr>
+          <w:rFonts w:ascii="David" w:cs="David" w:eastAsia="David" w:hAnsi="David"/>
+          <w:b w:val="false"/>
+          <w:bCs w:val="false"/>
+          <w:i w:val="false"/>
+          <w:iCs w:val="false"/>
+          <w:sz w:val="24"/>
+          <w:szCs w:val="24"/>
+          <w:rtl/>
+        </w:rPr>
+        <w:t xml:space="preserve"> לא כאירוע חד-פעמי ולא בחזית המרפאה, כדי לתת מענה לחשש מן החשיפה החברתית שנמצא חזק מן החשיפה הגופנית.</w:t>
+      </w:r>
+    </w:p>
+    <w:p>
+      <w:pPr>
+        <w:bidi/>
+        <w:spacing w:after="100" w:line="480" w:lineRule="auto"/>
+        <w:ind w:right="560" w:hanging="560"/>
+        <w:jc w:val="both"/>
+      </w:pPr>
+      <w:r>
+        <w:rPr>
+          <w:rFonts w:ascii="David" w:cs="David" w:eastAsia="David" w:hAnsi="David"/>
+          <w:b/>
+          <w:bCs/>
+          <w:i w:val="false"/>
+          <w:iCs w:val="false"/>
+          <w:sz w:val="24"/>
+          <w:szCs w:val="24"/>
+          <w:rtl/>
+        </w:rPr>
+        <w:t xml:space="preserve">5-  מפגשים ביתיים בהנחיית נשים מקומיות שנבדקו.</w:t>
+      </w:r>
+      <w:r>
+        <w:rPr>
+          <w:rFonts w:ascii="David" w:cs="David" w:eastAsia="David" w:hAnsi="David"/>
+          <w:b w:val="false"/>
+          <w:bCs w:val="false"/>
+          <w:i w:val="false"/>
+          <w:iCs w:val="false"/>
+          <w:sz w:val="24"/>
+          <w:szCs w:val="24"/>
+          <w:rtl/>
+        </w:rPr>
+        <w:t xml:space="preserve"> המנחות יהיו נשים מן היישוב שכבר נבדקו, ובהן מי שהחלימה מן המחלה. המפגש מתקיים במסגרת קטנה ומוכרת ובליווי מקצועי, במקום הרצאה פומבית, שכן הראיונות מלמדים כי המסגרת היא שעושה את ההבדל ולא תוכן המסר.</w:t>
+      </w:r>
+    </w:p>
+    <w:p>
+      <w:pPr>
+        <w:bidi/>
+        <w:spacing w:after="100" w:line="480" w:lineRule="auto"/>
+        <w:ind w:right="560" w:hanging="560"/>
+        <w:jc w:val="both"/>
+      </w:pPr>
+      <w:r>
+        <w:rPr>
+          <w:rFonts w:ascii="David" w:cs="David" w:eastAsia="David" w:hAnsi="David"/>
+          <w:b/>
+          <w:bCs/>
+          <w:i w:val="false"/>
+          <w:iCs w:val="false"/>
+          <w:sz w:val="24"/>
+          <w:szCs w:val="24"/>
+          <w:rtl/>
+        </w:rPr>
+        <w:t xml:space="preserve">6-  בחינת הרחבת הזימון היזום לגילאי 45 עד 49.</w:t>
+      </w:r>
+      <w:r>
+        <w:rPr>
+          <w:rFonts w:ascii="David" w:cs="David" w:eastAsia="David" w:hAnsi="David"/>
+          <w:b w:val="false"/>
+          <w:bCs w:val="false"/>
+          <w:i w:val="false"/>
+          <w:iCs w:val="false"/>
+          <w:sz w:val="24"/>
+          <w:szCs w:val="24"/>
+          <w:rtl/>
+        </w:rPr>
+        <w:t xml:space="preserve"> ההרחבה מוצעת לקהילות שבהן חציון גיל האבחון צעיר משמעותית, ובראשן החברה הבדואית בנגב, שבה חלק ניכר מן התחלואה מתרחש מתחת לגיל הסף הנוכחי.</w:t>
       </w:r>
     </w:p>
     <w:p>
@@ -6621,7 +6735,7 @@
           <w:szCs w:val="24"/>
           <w:rtl/>
         </w:rPr>
-        <w:t xml:space="preserve">שלוש ההמלצות הראשונות ניתנות ליישום ברמת המרפאה ובעלות נמוכה יחסית, והשלוש האחרונות מחייבות החלטה ברמת הקופה או המשרד. משותף לכולן שהן אינן מנסות לשנות את אמונותיהן של הנשים אלא להסיר את מה שעומד בין האמונה למעשה, וזהו בדיוק המקום שבו הראיונות מלמדים כי נמצא הפער.</w:t>
+        <w:t xml:space="preserve">משותף לשש ההמלצות שהן אינן מנסות לשנות את אמונותיהן של הנשים אלא להסיר את מה שעומד בין האמונה למעשה, וזהו בדיוק המקום שבו הראיונות מלמדים כי נמצא הפער.</w:t>
       </w:r>
     </w:p>
     <w:p>

</xml_diff>